<commit_message>
feat(ui): implement full-size PDF label preview
Introduces a new PDF-based preview system for label creation, replacing
the previous image-based barcode preview. This provides a more accurate
representation of the final printed label.

- Add `pdfjs-dist` and `pdf-lib` dependencies for PDF rendering.
- Implement `LabelPdfPreview` component using `pdf.js` to render a
  server-side generated PDF onto a canvas.
- Refactor label geometry into a dedicated `label-geometry.ts` module.
- Update `docx-writer` to optimize ingredient text placement, ensuring
  content starts immediately after the "Ingredients:" label to prevent
  unnecessary line wraps.
- Adjust label layout to provide more vertical space for ingredients.
- Update version to 1.2.1 and refresh release notes.

Ref: Issue/problems-to-fix.md
</commit_message>
<xml_diff>
--- a/sample/Lava Cake Label 6''x4''.docx
+++ b/sample/Lava Cake Label 6''x4''.docx
@@ -14,16 +14,16 @@
         <mc:AlternateContent>
           <mc:Choice Requires="wps">
             <w:drawing>
-              <wp:anchor distT="0" distB="0" distL="114300" distR="114300" simplePos="0" relativeHeight="251662336" behindDoc="0" locked="0" layoutInCell="1" allowOverlap="1" wp14:anchorId="605AC7E1" wp14:editId="547C437E">
+              <wp:anchor distT="0" distB="0" distL="114300" distR="114300" simplePos="0" relativeHeight="251662336" behindDoc="0" locked="0" layoutInCell="1" allowOverlap="1" wp14:anchorId="605AC7E1" wp14:editId="63F07D3A">
                 <wp:simplePos x="0" y="0"/>
                 <wp:positionH relativeFrom="column">
                   <wp:posOffset>-704850</wp:posOffset>
                 </wp:positionH>
                 <wp:positionV relativeFrom="paragraph">
-                  <wp:posOffset>428625</wp:posOffset>
+                  <wp:posOffset>247416</wp:posOffset>
                 </wp:positionV>
                 <wp:extent cx="1962150" cy="811530"/>
-                <wp:effectExtent l="0" t="0" r="19050" b="26670"/>
+                <wp:effectExtent l="0" t="0" r="19050" b="13970"/>
                 <wp:wrapNone/>
                 <wp:docPr id="1453253869" name="Text Box 3"/>
                 <wp:cNvGraphicFramePr/>
@@ -163,7 +163,7 @@
                 <v:stroke joinstyle="miter"/>
                 <v:path gradientshapeok="t" o:connecttype="rect"/>
               </v:shapetype>
-              <v:shape id="Text Box 3" o:spid="_x0000_s1026" type="#_x0000_t202" style="position:absolute;left:0;text-align:left;margin-left:-55.5pt;margin-top:33.75pt;width:154.5pt;height:63.9pt;z-index:251662336;visibility:visible;mso-wrap-style:square;mso-width-percent:0;mso-height-percent:0;mso-wrap-distance-left:9pt;mso-wrap-distance-top:0;mso-wrap-distance-right:9pt;mso-wrap-distance-bottom:0;mso-position-horizontal:absolute;mso-position-horizontal-relative:text;mso-position-vertical:absolute;mso-position-vertical-relative:text;mso-width-percent:0;mso-height-percent:0;mso-width-relative:margin;mso-height-relative:margin;v-text-anchor:top" o:gfxdata="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" fillcolor="white [3201]" strokeweight="1pt">
+              <v:shape id="Text Box 3" o:spid="_x0000_s1026" type="#_x0000_t202" style="position:absolute;left:0;text-align:left;margin-left:-55.5pt;margin-top:19.5pt;width:154.5pt;height:63.9pt;z-index:251662336;visibility:visible;mso-wrap-style:square;mso-width-percent:0;mso-height-percent:0;mso-wrap-distance-left:9pt;mso-wrap-distance-top:0;mso-wrap-distance-right:9pt;mso-wrap-distance-bottom:0;mso-position-horizontal:absolute;mso-position-horizontal-relative:text;mso-position-vertical:absolute;mso-position-vertical-relative:text;mso-width-percent:0;mso-height-percent:0;mso-width-relative:margin;mso-height-relative:margin;v-text-anchor:top" o:gfxdata="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" fillcolor="white [3201]" strokeweight="1pt">
                 <v:textbox>
                   <w:txbxContent>
                     <w:p>
@@ -251,773 +251,6 @@
                           <w:rFonts w:ascii="Arial" w:hAnsi="Arial" w:cs="Arial"/>
                         </w:rPr>
                         <w:t>15</w:t>
-                      </w:r>
-                    </w:p>
-                  </w:txbxContent>
-                </v:textbox>
-              </v:shape>
-            </w:pict>
-          </mc:Fallback>
-        </mc:AlternateContent>
-      </w:r>
-      <w:r>
-        <w:rPr>
-          <w:noProof/>
-        </w:rPr>
-        <mc:AlternateContent>
-          <mc:Choice Requires="wps">
-            <w:drawing>
-              <wp:anchor distT="0" distB="0" distL="114300" distR="114300" simplePos="0" relativeHeight="251664384" behindDoc="0" locked="0" layoutInCell="1" allowOverlap="1" wp14:anchorId="0DEE5C9D" wp14:editId="1522A371">
-                <wp:simplePos x="0" y="0"/>
-                <wp:positionH relativeFrom="column">
-                  <wp:posOffset>-698500</wp:posOffset>
-                </wp:positionH>
-                <wp:positionV relativeFrom="paragraph">
-                  <wp:posOffset>1543050</wp:posOffset>
-                </wp:positionV>
-                <wp:extent cx="3211195" cy="1276350"/>
-                <wp:effectExtent l="0" t="0" r="27305" b="19050"/>
-                <wp:wrapNone/>
-                <wp:docPr id="1336787459" name="Text Box 5"/>
-                <wp:cNvGraphicFramePr/>
-                <a:graphic xmlns:a="http://schemas.openxmlformats.org/drawingml/2006/main">
-                  <a:graphicData uri="http://schemas.microsoft.com/office/word/2010/wordprocessingShape">
-                    <wps:wsp>
-                      <wps:cNvSpPr txBox="1"/>
-                      <wps:spPr>
-                        <a:xfrm>
-                          <a:off x="0" y="0"/>
-                          <a:ext cx="3211195" cy="1276350"/>
-                        </a:xfrm>
-                        <a:prstGeom prst="rect">
-                          <a:avLst/>
-                        </a:prstGeom>
-                        <a:solidFill>
-                          <a:schemeClr val="lt1"/>
-                        </a:solidFill>
-                        <a:ln w="12700">
-                          <a:solidFill>
-                            <a:prstClr val="black"/>
-                          </a:solidFill>
-                        </a:ln>
-                      </wps:spPr>
-                      <wps:txbx>
-                        <w:txbxContent>
-                          <w:p>
-                            <w:pPr>
-                              <w:rPr>
-                                <w:rFonts w:ascii="Arial" w:hAnsi="Arial" w:cs="Arial"/>
-                                <w:sz w:val="20"/>
-                                <w:szCs w:val="20"/>
-                              </w:rPr>
-                            </w:pPr>
-                            <w:r>
-                              <w:rPr>
-                                <w:rFonts w:ascii="Arial" w:hAnsi="Arial" w:cs="Arial"/>
-                                <w:b/>
-                                <w:bCs/>
-                                <w:sz w:val="20"/>
-                                <w:szCs w:val="20"/>
-                              </w:rPr>
-                              <w:t>Ingredients:</w:t>
-                            </w:r>
-                            <w:r>
-                              <w:rPr>
-                                <w:sz w:val="20"/>
-                                <w:szCs w:val="20"/>
-                              </w:rPr>
-                              <w:t xml:space="preserve"> </w:t>
-                            </w:r>
-                            <w:r>
-                              <w:rPr>
-                                <w:rFonts w:ascii="Arial" w:hAnsi="Arial" w:cs="Arial"/>
-                                <w:sz w:val="20"/>
-                                <w:szCs w:val="20"/>
-                              </w:rPr>
-                              <w:t>Eggs, sugar, wheat flour, margarine (modified palm oil,</w:t>
-                            </w:r>
-                            <w:r>
-                              <w:rPr>
-                                <w:rFonts w:ascii="Arial" w:hAnsi="Arial" w:cs="Arial"/>
-                                <w:sz w:val="20"/>
-                                <w:szCs w:val="20"/>
-                              </w:rPr>
-                              <w:t xml:space="preserve"> </w:t>
-                            </w:r>
-                            <w:r>
-                              <w:rPr>
-                                <w:rFonts w:ascii="Arial" w:hAnsi="Arial" w:cs="Arial"/>
-                                <w:sz w:val="20"/>
-                                <w:szCs w:val="20"/>
-                              </w:rPr>
-                              <w:t>water, monoglycerides, potassium sorbate,</w:t>
-                            </w:r>
-                            <w:r>
-                              <w:rPr>
-                                <w:rFonts w:ascii="Arial" w:hAnsi="Arial" w:cs="Arial"/>
-                                <w:sz w:val="20"/>
-                                <w:szCs w:val="20"/>
-                              </w:rPr>
-                              <w:t xml:space="preserve"> </w:t>
-                            </w:r>
-                            <w:proofErr w:type="spellStart"/>
-                            <w:r>
-                              <w:rPr>
-                                <w:rFonts w:ascii="Arial" w:hAnsi="Arial" w:cs="Arial"/>
-                                <w:sz w:val="20"/>
-                                <w:szCs w:val="20"/>
-                              </w:rPr>
-                              <w:t>citirc</w:t>
-                            </w:r>
-                            <w:proofErr w:type="spellEnd"/>
-                            <w:r>
-                              <w:rPr>
-                                <w:rFonts w:ascii="Arial" w:hAnsi="Arial" w:cs="Arial"/>
-                                <w:sz w:val="20"/>
-                                <w:szCs w:val="20"/>
-                              </w:rPr>
-                              <w:t xml:space="preserve"> acid, natural flavor,</w:t>
-                            </w:r>
-                            <w:r>
-                              <w:rPr>
-                                <w:rFonts w:ascii="Arial" w:hAnsi="Arial" w:cs="Arial"/>
-                                <w:sz w:val="20"/>
-                                <w:szCs w:val="20"/>
-                              </w:rPr>
-                              <w:t xml:space="preserve"> </w:t>
-                            </w:r>
-                            <w:r>
-                              <w:rPr>
-                                <w:rFonts w:ascii="Arial" w:hAnsi="Arial" w:cs="Arial"/>
-                                <w:sz w:val="20"/>
-                                <w:szCs w:val="20"/>
-                              </w:rPr>
-                              <w:t>vitamin A palmitate,</w:t>
-                            </w:r>
-                            <w:r>
-                              <w:rPr>
-                                <w:rFonts w:ascii="Arial" w:hAnsi="Arial" w:cs="Arial"/>
-                                <w:sz w:val="20"/>
-                                <w:szCs w:val="20"/>
-                              </w:rPr>
-                              <w:t xml:space="preserve"> </w:t>
-                            </w:r>
-                            <w:r>
-                              <w:rPr>
-                                <w:rFonts w:ascii="Arial" w:hAnsi="Arial" w:cs="Arial"/>
-                                <w:sz w:val="20"/>
-                                <w:szCs w:val="20"/>
-                              </w:rPr>
-                              <w:t>vitamin D3)</w:t>
-                            </w:r>
-                            <w:r>
-                              <w:rPr>
-                                <w:rFonts w:ascii="Arial" w:hAnsi="Arial" w:cs="Arial"/>
-                                <w:sz w:val="20"/>
-                                <w:szCs w:val="20"/>
-                              </w:rPr>
-                              <w:t xml:space="preserve"> </w:t>
-                            </w:r>
-                            <w:r>
-                              <w:rPr>
-                                <w:rFonts w:ascii="Arial" w:hAnsi="Arial" w:cs="Arial"/>
-                                <w:sz w:val="20"/>
-                                <w:szCs w:val="20"/>
-                              </w:rPr>
-                              <w:t>Dark Chocolate</w:t>
-                            </w:r>
-                            <w:r>
-                              <w:rPr>
-                                <w:rFonts w:ascii="Arial" w:hAnsi="Arial" w:cs="Arial"/>
-                                <w:sz w:val="20"/>
-                                <w:szCs w:val="20"/>
-                              </w:rPr>
-                              <w:t xml:space="preserve"> </w:t>
-                            </w:r>
-                            <w:r>
-                              <w:rPr>
-                                <w:rFonts w:ascii="Arial" w:hAnsi="Arial" w:cs="Arial"/>
-                                <w:sz w:val="20"/>
-                                <w:szCs w:val="20"/>
-                              </w:rPr>
-                              <w:t>(sugar,</w:t>
-                            </w:r>
-                            <w:r>
-                              <w:rPr>
-                                <w:rFonts w:ascii="Arial" w:hAnsi="Arial" w:cs="Arial"/>
-                                <w:sz w:val="20"/>
-                                <w:szCs w:val="20"/>
-                              </w:rPr>
-                              <w:t xml:space="preserve"> </w:t>
-                            </w:r>
-                            <w:r>
-                              <w:rPr>
-                                <w:rFonts w:ascii="Arial" w:hAnsi="Arial" w:cs="Arial"/>
-                                <w:sz w:val="20"/>
-                                <w:szCs w:val="20"/>
-                              </w:rPr>
-                              <w:t>cocoa butter,</w:t>
-                            </w:r>
-                            <w:r>
-                              <w:rPr>
-                                <w:rFonts w:ascii="Arial" w:hAnsi="Arial" w:cs="Arial"/>
-                                <w:sz w:val="20"/>
-                                <w:szCs w:val="20"/>
-                              </w:rPr>
-                              <w:t xml:space="preserve"> </w:t>
-                            </w:r>
-                            <w:proofErr w:type="spellStart"/>
-                            <w:r>
-                              <w:rPr>
-                                <w:rFonts w:ascii="Arial" w:hAnsi="Arial" w:cs="Arial"/>
-                                <w:sz w:val="20"/>
-                                <w:szCs w:val="20"/>
-                              </w:rPr>
-                              <w:t>blegian</w:t>
-                            </w:r>
-                            <w:proofErr w:type="spellEnd"/>
-                            <w:r>
-                              <w:rPr>
-                                <w:rFonts w:ascii="Arial" w:hAnsi="Arial" w:cs="Arial"/>
-                                <w:sz w:val="20"/>
-                                <w:szCs w:val="20"/>
-                              </w:rPr>
-                              <w:t xml:space="preserve"> unsweetened chocolate,</w:t>
-                            </w:r>
-                            <w:r>
-                              <w:rPr>
-                                <w:rFonts w:ascii="Arial" w:hAnsi="Arial" w:cs="Arial"/>
-                                <w:sz w:val="20"/>
-                                <w:szCs w:val="20"/>
-                              </w:rPr>
-                              <w:t xml:space="preserve"> </w:t>
-                            </w:r>
-                            <w:r>
-                              <w:rPr>
-                                <w:rFonts w:ascii="Arial" w:hAnsi="Arial" w:cs="Arial"/>
-                                <w:sz w:val="20"/>
-                                <w:szCs w:val="20"/>
-                              </w:rPr>
-                              <w:t xml:space="preserve">soy </w:t>
-                            </w:r>
-                            <w:proofErr w:type="spellStart"/>
-                            <w:r>
-                              <w:rPr>
-                                <w:rFonts w:ascii="Arial" w:hAnsi="Arial" w:cs="Arial"/>
-                                <w:sz w:val="20"/>
-                                <w:szCs w:val="20"/>
-                              </w:rPr>
-                              <w:t>licithin</w:t>
-                            </w:r>
-                            <w:proofErr w:type="spellEnd"/>
-                            <w:r>
-                              <w:rPr>
-                                <w:rFonts w:ascii="Arial" w:hAnsi="Arial" w:cs="Arial"/>
-                                <w:sz w:val="20"/>
-                                <w:szCs w:val="20"/>
-                              </w:rPr>
-                              <w:t>,</w:t>
-                            </w:r>
-                            <w:r>
-                              <w:rPr>
-                                <w:rFonts w:ascii="Arial" w:hAnsi="Arial" w:cs="Arial"/>
-                                <w:sz w:val="20"/>
-                                <w:szCs w:val="20"/>
-                              </w:rPr>
-                              <w:t xml:space="preserve"> </w:t>
-                            </w:r>
-                            <w:r>
-                              <w:rPr>
-                                <w:rFonts w:ascii="Arial" w:hAnsi="Arial" w:cs="Arial"/>
-                                <w:sz w:val="20"/>
-                                <w:szCs w:val="20"/>
-                              </w:rPr>
-                              <w:t xml:space="preserve">natural </w:t>
-                            </w:r>
-                            <w:proofErr w:type="spellStart"/>
-                            <w:r>
-                              <w:rPr>
-                                <w:rFonts w:ascii="Arial" w:hAnsi="Arial" w:cs="Arial"/>
-                                <w:sz w:val="20"/>
-                                <w:szCs w:val="20"/>
-                              </w:rPr>
-                              <w:t>anilla</w:t>
-                            </w:r>
-                            <w:proofErr w:type="spellEnd"/>
-                            <w:r>
-                              <w:rPr>
-                                <w:rFonts w:ascii="Arial" w:hAnsi="Arial" w:cs="Arial"/>
-                                <w:sz w:val="20"/>
-                                <w:szCs w:val="20"/>
-                              </w:rPr>
-                              <w:t xml:space="preserve"> extract) stabilizer,</w:t>
-                            </w:r>
-                            <w:r>
-                              <w:rPr>
-                                <w:rFonts w:ascii="Arial" w:hAnsi="Arial" w:cs="Arial"/>
-                                <w:sz w:val="20"/>
-                                <w:szCs w:val="20"/>
-                              </w:rPr>
-                              <w:t xml:space="preserve"> </w:t>
-                            </w:r>
-                            <w:r>
-                              <w:rPr>
-                                <w:rFonts w:ascii="Arial" w:hAnsi="Arial" w:cs="Arial"/>
-                                <w:sz w:val="20"/>
-                                <w:szCs w:val="20"/>
-                              </w:rPr>
-                              <w:t xml:space="preserve">coating </w:t>
-                            </w:r>
-                            <w:proofErr w:type="gramStart"/>
-                            <w:r>
-                              <w:rPr>
-                                <w:rFonts w:ascii="Arial" w:hAnsi="Arial" w:cs="Arial"/>
-                                <w:sz w:val="20"/>
-                                <w:szCs w:val="20"/>
-                              </w:rPr>
-                              <w:t>chocolate(</w:t>
-                            </w:r>
-                            <w:proofErr w:type="gramEnd"/>
-                            <w:r>
-                              <w:rPr>
-                                <w:rFonts w:ascii="Arial" w:hAnsi="Arial" w:cs="Arial"/>
-                                <w:sz w:val="20"/>
-                                <w:szCs w:val="20"/>
-                              </w:rPr>
-                              <w:t>sugar,</w:t>
-                            </w:r>
-                            <w:r>
-                              <w:rPr>
-                                <w:rFonts w:ascii="Arial" w:hAnsi="Arial" w:cs="Arial"/>
-                                <w:sz w:val="20"/>
-                                <w:szCs w:val="20"/>
-                              </w:rPr>
-                              <w:t xml:space="preserve"> </w:t>
-                            </w:r>
-                            <w:proofErr w:type="spellStart"/>
-                            <w:r>
-                              <w:rPr>
-                                <w:rFonts w:ascii="Arial" w:hAnsi="Arial" w:cs="Arial"/>
-                                <w:sz w:val="20"/>
-                                <w:szCs w:val="20"/>
-                              </w:rPr>
-                              <w:t>non hydrogenated</w:t>
-                            </w:r>
-                            <w:proofErr w:type="spellEnd"/>
-                            <w:r>
-                              <w:rPr>
-                                <w:rFonts w:ascii="Arial" w:hAnsi="Arial" w:cs="Arial"/>
-                                <w:sz w:val="20"/>
-                                <w:szCs w:val="20"/>
-                              </w:rPr>
-                              <w:t xml:space="preserve"> fats,</w:t>
-                            </w:r>
-                            <w:r>
-                              <w:rPr>
-                                <w:rFonts w:ascii="Arial" w:hAnsi="Arial" w:cs="Arial"/>
-                                <w:sz w:val="20"/>
-                                <w:szCs w:val="20"/>
-                              </w:rPr>
-                              <w:t xml:space="preserve"> </w:t>
-                            </w:r>
-                            <w:proofErr w:type="spellStart"/>
-                            <w:proofErr w:type="gramStart"/>
-                            <w:r>
-                              <w:rPr>
-                                <w:rFonts w:ascii="Arial" w:hAnsi="Arial" w:cs="Arial"/>
-                                <w:sz w:val="20"/>
-                                <w:szCs w:val="20"/>
-                              </w:rPr>
-                              <w:t>smulsifier</w:t>
-                            </w:r>
-                            <w:proofErr w:type="spellEnd"/>
-                            <w:r>
-                              <w:rPr>
-                                <w:rFonts w:ascii="Arial" w:hAnsi="Arial" w:cs="Arial"/>
-                                <w:sz w:val="20"/>
-                                <w:szCs w:val="20"/>
-                              </w:rPr>
-                              <w:t xml:space="preserve"> ,coco</w:t>
-                            </w:r>
-                            <w:proofErr w:type="gramEnd"/>
-                            <w:r>
-                              <w:rPr>
-                                <w:rFonts w:ascii="Arial" w:hAnsi="Arial" w:cs="Arial"/>
-                                <w:sz w:val="20"/>
-                                <w:szCs w:val="20"/>
-                              </w:rPr>
-                              <w:t xml:space="preserve"> powder).</w:t>
-                            </w:r>
-                          </w:p>
-                        </w:txbxContent>
-                      </wps:txbx>
-                      <wps:bodyPr rot="0" spcFirstLastPara="0" vertOverflow="overflow" horzOverflow="overflow" vert="horz" wrap="square" lIns="91440" tIns="45720" rIns="91440" bIns="45720" numCol="1" spcCol="0" rtlCol="0" fromWordArt="0" anchor="t" anchorCtr="0" forceAA="0" compatLnSpc="1">
-                        <a:prstTxWarp prst="textNoShape">
-                          <a:avLst/>
-                        </a:prstTxWarp>
-                        <a:noAutofit/>
-                      </wps:bodyPr>
-                    </wps:wsp>
-                  </a:graphicData>
-                </a:graphic>
-                <wp14:sizeRelH relativeFrom="margin">
-                  <wp14:pctWidth>0</wp14:pctWidth>
-                </wp14:sizeRelH>
-                <wp14:sizeRelV relativeFrom="margin">
-                  <wp14:pctHeight>0</wp14:pctHeight>
-                </wp14:sizeRelV>
-              </wp:anchor>
-            </w:drawing>
-          </mc:Choice>
-          <mc:Fallback>
-            <w:pict>
-              <v:shape w14:anchorId="0DEE5C9D" id="Text Box 5" o:spid="_x0000_s1027" type="#_x0000_t202" style="position:absolute;left:0;text-align:left;margin-left:-55pt;margin-top:121.5pt;width:252.85pt;height:100.5pt;z-index:251664384;visibility:visible;mso-wrap-style:square;mso-width-percent:0;mso-height-percent:0;mso-wrap-distance-left:9pt;mso-wrap-distance-top:0;mso-wrap-distance-right:9pt;mso-wrap-distance-bottom:0;mso-position-horizontal:absolute;mso-position-horizontal-relative:text;mso-position-vertical:absolute;mso-position-vertical-relative:text;mso-width-percent:0;mso-height-percent:0;mso-width-relative:margin;mso-height-relative:margin;v-text-anchor:top" o:gfxdata="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" fillcolor="white [3201]" strokeweight="1pt">
-                <v:textbox>
-                  <w:txbxContent>
-                    <w:p>
-                      <w:pPr>
-                        <w:rPr>
-                          <w:rFonts w:ascii="Arial" w:hAnsi="Arial" w:cs="Arial"/>
-                          <w:sz w:val="20"/>
-                          <w:szCs w:val="20"/>
-                        </w:rPr>
-                      </w:pPr>
-                      <w:r>
-                        <w:rPr>
-                          <w:rFonts w:ascii="Arial" w:hAnsi="Arial" w:cs="Arial"/>
-                          <w:b/>
-                          <w:bCs/>
-                          <w:sz w:val="20"/>
-                          <w:szCs w:val="20"/>
-                        </w:rPr>
-                        <w:t>Ingredients:</w:t>
-                      </w:r>
-                      <w:r>
-                        <w:rPr>
-                          <w:sz w:val="20"/>
-                          <w:szCs w:val="20"/>
-                        </w:rPr>
-                        <w:t xml:space="preserve"> </w:t>
-                      </w:r>
-                      <w:r>
-                        <w:rPr>
-                          <w:rFonts w:ascii="Arial" w:hAnsi="Arial" w:cs="Arial"/>
-                          <w:sz w:val="20"/>
-                          <w:szCs w:val="20"/>
-                        </w:rPr>
-                        <w:t>Eggs, sugar, wheat flour, margarine (modified palm oil,</w:t>
-                      </w:r>
-                      <w:r>
-                        <w:rPr>
-                          <w:rFonts w:ascii="Arial" w:hAnsi="Arial" w:cs="Arial"/>
-                          <w:sz w:val="20"/>
-                          <w:szCs w:val="20"/>
-                        </w:rPr>
-                        <w:t xml:space="preserve"> </w:t>
-                      </w:r>
-                      <w:r>
-                        <w:rPr>
-                          <w:rFonts w:ascii="Arial" w:hAnsi="Arial" w:cs="Arial"/>
-                          <w:sz w:val="20"/>
-                          <w:szCs w:val="20"/>
-                        </w:rPr>
-                        <w:t>water, monoglycerides, potassium sorbate,</w:t>
-                      </w:r>
-                      <w:r>
-                        <w:rPr>
-                          <w:rFonts w:ascii="Arial" w:hAnsi="Arial" w:cs="Arial"/>
-                          <w:sz w:val="20"/>
-                          <w:szCs w:val="20"/>
-                        </w:rPr>
-                        <w:t xml:space="preserve"> </w:t>
-                      </w:r>
-                      <w:proofErr w:type="spellStart"/>
-                      <w:r>
-                        <w:rPr>
-                          <w:rFonts w:ascii="Arial" w:hAnsi="Arial" w:cs="Arial"/>
-                          <w:sz w:val="20"/>
-                          <w:szCs w:val="20"/>
-                        </w:rPr>
-                        <w:t>citirc</w:t>
-                      </w:r>
-                      <w:proofErr w:type="spellEnd"/>
-                      <w:r>
-                        <w:rPr>
-                          <w:rFonts w:ascii="Arial" w:hAnsi="Arial" w:cs="Arial"/>
-                          <w:sz w:val="20"/>
-                          <w:szCs w:val="20"/>
-                        </w:rPr>
-                        <w:t xml:space="preserve"> acid, natural flavor,</w:t>
-                      </w:r>
-                      <w:r>
-                        <w:rPr>
-                          <w:rFonts w:ascii="Arial" w:hAnsi="Arial" w:cs="Arial"/>
-                          <w:sz w:val="20"/>
-                          <w:szCs w:val="20"/>
-                        </w:rPr>
-                        <w:t xml:space="preserve"> </w:t>
-                      </w:r>
-                      <w:r>
-                        <w:rPr>
-                          <w:rFonts w:ascii="Arial" w:hAnsi="Arial" w:cs="Arial"/>
-                          <w:sz w:val="20"/>
-                          <w:szCs w:val="20"/>
-                        </w:rPr>
-                        <w:t>vitamin A palmitate,</w:t>
-                      </w:r>
-                      <w:r>
-                        <w:rPr>
-                          <w:rFonts w:ascii="Arial" w:hAnsi="Arial" w:cs="Arial"/>
-                          <w:sz w:val="20"/>
-                          <w:szCs w:val="20"/>
-                        </w:rPr>
-                        <w:t xml:space="preserve"> </w:t>
-                      </w:r>
-                      <w:r>
-                        <w:rPr>
-                          <w:rFonts w:ascii="Arial" w:hAnsi="Arial" w:cs="Arial"/>
-                          <w:sz w:val="20"/>
-                          <w:szCs w:val="20"/>
-                        </w:rPr>
-                        <w:t>vitamin D3)</w:t>
-                      </w:r>
-                      <w:r>
-                        <w:rPr>
-                          <w:rFonts w:ascii="Arial" w:hAnsi="Arial" w:cs="Arial"/>
-                          <w:sz w:val="20"/>
-                          <w:szCs w:val="20"/>
-                        </w:rPr>
-                        <w:t xml:space="preserve"> </w:t>
-                      </w:r>
-                      <w:r>
-                        <w:rPr>
-                          <w:rFonts w:ascii="Arial" w:hAnsi="Arial" w:cs="Arial"/>
-                          <w:sz w:val="20"/>
-                          <w:szCs w:val="20"/>
-                        </w:rPr>
-                        <w:t>Dark Chocolate</w:t>
-                      </w:r>
-                      <w:r>
-                        <w:rPr>
-                          <w:rFonts w:ascii="Arial" w:hAnsi="Arial" w:cs="Arial"/>
-                          <w:sz w:val="20"/>
-                          <w:szCs w:val="20"/>
-                        </w:rPr>
-                        <w:t xml:space="preserve"> </w:t>
-                      </w:r>
-                      <w:r>
-                        <w:rPr>
-                          <w:rFonts w:ascii="Arial" w:hAnsi="Arial" w:cs="Arial"/>
-                          <w:sz w:val="20"/>
-                          <w:szCs w:val="20"/>
-                        </w:rPr>
-                        <w:t>(sugar,</w:t>
-                      </w:r>
-                      <w:r>
-                        <w:rPr>
-                          <w:rFonts w:ascii="Arial" w:hAnsi="Arial" w:cs="Arial"/>
-                          <w:sz w:val="20"/>
-                          <w:szCs w:val="20"/>
-                        </w:rPr>
-                        <w:t xml:space="preserve"> </w:t>
-                      </w:r>
-                      <w:r>
-                        <w:rPr>
-                          <w:rFonts w:ascii="Arial" w:hAnsi="Arial" w:cs="Arial"/>
-                          <w:sz w:val="20"/>
-                          <w:szCs w:val="20"/>
-                        </w:rPr>
-                        <w:t>cocoa butter,</w:t>
-                      </w:r>
-                      <w:r>
-                        <w:rPr>
-                          <w:rFonts w:ascii="Arial" w:hAnsi="Arial" w:cs="Arial"/>
-                          <w:sz w:val="20"/>
-                          <w:szCs w:val="20"/>
-                        </w:rPr>
-                        <w:t xml:space="preserve"> </w:t>
-                      </w:r>
-                      <w:proofErr w:type="spellStart"/>
-                      <w:r>
-                        <w:rPr>
-                          <w:rFonts w:ascii="Arial" w:hAnsi="Arial" w:cs="Arial"/>
-                          <w:sz w:val="20"/>
-                          <w:szCs w:val="20"/>
-                        </w:rPr>
-                        <w:t>blegian</w:t>
-                      </w:r>
-                      <w:proofErr w:type="spellEnd"/>
-                      <w:r>
-                        <w:rPr>
-                          <w:rFonts w:ascii="Arial" w:hAnsi="Arial" w:cs="Arial"/>
-                          <w:sz w:val="20"/>
-                          <w:szCs w:val="20"/>
-                        </w:rPr>
-                        <w:t xml:space="preserve"> unsweetened chocolate,</w:t>
-                      </w:r>
-                      <w:r>
-                        <w:rPr>
-                          <w:rFonts w:ascii="Arial" w:hAnsi="Arial" w:cs="Arial"/>
-                          <w:sz w:val="20"/>
-                          <w:szCs w:val="20"/>
-                        </w:rPr>
-                        <w:t xml:space="preserve"> </w:t>
-                      </w:r>
-                      <w:r>
-                        <w:rPr>
-                          <w:rFonts w:ascii="Arial" w:hAnsi="Arial" w:cs="Arial"/>
-                          <w:sz w:val="20"/>
-                          <w:szCs w:val="20"/>
-                        </w:rPr>
-                        <w:t xml:space="preserve">soy </w:t>
-                      </w:r>
-                      <w:proofErr w:type="spellStart"/>
-                      <w:r>
-                        <w:rPr>
-                          <w:rFonts w:ascii="Arial" w:hAnsi="Arial" w:cs="Arial"/>
-                          <w:sz w:val="20"/>
-                          <w:szCs w:val="20"/>
-                        </w:rPr>
-                        <w:t>licithin</w:t>
-                      </w:r>
-                      <w:proofErr w:type="spellEnd"/>
-                      <w:r>
-                        <w:rPr>
-                          <w:rFonts w:ascii="Arial" w:hAnsi="Arial" w:cs="Arial"/>
-                          <w:sz w:val="20"/>
-                          <w:szCs w:val="20"/>
-                        </w:rPr>
-                        <w:t>,</w:t>
-                      </w:r>
-                      <w:r>
-                        <w:rPr>
-                          <w:rFonts w:ascii="Arial" w:hAnsi="Arial" w:cs="Arial"/>
-                          <w:sz w:val="20"/>
-                          <w:szCs w:val="20"/>
-                        </w:rPr>
-                        <w:t xml:space="preserve"> </w:t>
-                      </w:r>
-                      <w:r>
-                        <w:rPr>
-                          <w:rFonts w:ascii="Arial" w:hAnsi="Arial" w:cs="Arial"/>
-                          <w:sz w:val="20"/>
-                          <w:szCs w:val="20"/>
-                        </w:rPr>
-                        <w:t xml:space="preserve">natural </w:t>
-                      </w:r>
-                      <w:proofErr w:type="spellStart"/>
-                      <w:r>
-                        <w:rPr>
-                          <w:rFonts w:ascii="Arial" w:hAnsi="Arial" w:cs="Arial"/>
-                          <w:sz w:val="20"/>
-                          <w:szCs w:val="20"/>
-                        </w:rPr>
-                        <w:t>anilla</w:t>
-                      </w:r>
-                      <w:proofErr w:type="spellEnd"/>
-                      <w:r>
-                        <w:rPr>
-                          <w:rFonts w:ascii="Arial" w:hAnsi="Arial" w:cs="Arial"/>
-                          <w:sz w:val="20"/>
-                          <w:szCs w:val="20"/>
-                        </w:rPr>
-                        <w:t xml:space="preserve"> extract) stabilizer,</w:t>
-                      </w:r>
-                      <w:r>
-                        <w:rPr>
-                          <w:rFonts w:ascii="Arial" w:hAnsi="Arial" w:cs="Arial"/>
-                          <w:sz w:val="20"/>
-                          <w:szCs w:val="20"/>
-                        </w:rPr>
-                        <w:t xml:space="preserve"> </w:t>
-                      </w:r>
-                      <w:r>
-                        <w:rPr>
-                          <w:rFonts w:ascii="Arial" w:hAnsi="Arial" w:cs="Arial"/>
-                          <w:sz w:val="20"/>
-                          <w:szCs w:val="20"/>
-                        </w:rPr>
-                        <w:t xml:space="preserve">coating </w:t>
-                      </w:r>
-                      <w:proofErr w:type="gramStart"/>
-                      <w:r>
-                        <w:rPr>
-                          <w:rFonts w:ascii="Arial" w:hAnsi="Arial" w:cs="Arial"/>
-                          <w:sz w:val="20"/>
-                          <w:szCs w:val="20"/>
-                        </w:rPr>
-                        <w:t>chocolate(</w:t>
-                      </w:r>
-                      <w:proofErr w:type="gramEnd"/>
-                      <w:r>
-                        <w:rPr>
-                          <w:rFonts w:ascii="Arial" w:hAnsi="Arial" w:cs="Arial"/>
-                          <w:sz w:val="20"/>
-                          <w:szCs w:val="20"/>
-                        </w:rPr>
-                        <w:t>sugar,</w:t>
-                      </w:r>
-                      <w:r>
-                        <w:rPr>
-                          <w:rFonts w:ascii="Arial" w:hAnsi="Arial" w:cs="Arial"/>
-                          <w:sz w:val="20"/>
-                          <w:szCs w:val="20"/>
-                        </w:rPr>
-                        <w:t xml:space="preserve"> </w:t>
-                      </w:r>
-                      <w:proofErr w:type="spellStart"/>
-                      <w:r>
-                        <w:rPr>
-                          <w:rFonts w:ascii="Arial" w:hAnsi="Arial" w:cs="Arial"/>
-                          <w:sz w:val="20"/>
-                          <w:szCs w:val="20"/>
-                        </w:rPr>
-                        <w:t>non hydrogenated</w:t>
-                      </w:r>
-                      <w:proofErr w:type="spellEnd"/>
-                      <w:r>
-                        <w:rPr>
-                          <w:rFonts w:ascii="Arial" w:hAnsi="Arial" w:cs="Arial"/>
-                          <w:sz w:val="20"/>
-                          <w:szCs w:val="20"/>
-                        </w:rPr>
-                        <w:t xml:space="preserve"> fats,</w:t>
-                      </w:r>
-                      <w:r>
-                        <w:rPr>
-                          <w:rFonts w:ascii="Arial" w:hAnsi="Arial" w:cs="Arial"/>
-                          <w:sz w:val="20"/>
-                          <w:szCs w:val="20"/>
-                        </w:rPr>
-                        <w:t xml:space="preserve"> </w:t>
-                      </w:r>
-                      <w:proofErr w:type="spellStart"/>
-                      <w:proofErr w:type="gramStart"/>
-                      <w:r>
-                        <w:rPr>
-                          <w:rFonts w:ascii="Arial" w:hAnsi="Arial" w:cs="Arial"/>
-                          <w:sz w:val="20"/>
-                          <w:szCs w:val="20"/>
-                        </w:rPr>
-                        <w:t>smulsifier</w:t>
-                      </w:r>
-                      <w:proofErr w:type="spellEnd"/>
-                      <w:r>
-                        <w:rPr>
-                          <w:rFonts w:ascii="Arial" w:hAnsi="Arial" w:cs="Arial"/>
-                          <w:sz w:val="20"/>
-                          <w:szCs w:val="20"/>
-                        </w:rPr>
-                        <w:t xml:space="preserve"> ,coco</w:t>
-                      </w:r>
-                      <w:proofErr w:type="gramEnd"/>
-                      <w:r>
-                        <w:rPr>
-                          <w:rFonts w:ascii="Arial" w:hAnsi="Arial" w:cs="Arial"/>
-                          <w:sz w:val="20"/>
-                          <w:szCs w:val="20"/>
-                        </w:rPr>
-                        <w:t xml:space="preserve"> powder).</w:t>
                       </w:r>
                     </w:p>
                   </w:txbxContent>
@@ -1032,7 +265,7 @@
           <w:noProof/>
         </w:rPr>
         <w:drawing>
-          <wp:anchor distT="0" distB="0" distL="114300" distR="114300" simplePos="0" relativeHeight="251660288" behindDoc="0" locked="0" layoutInCell="1" allowOverlap="1" wp14:anchorId="2CA4DD5F" wp14:editId="68303872">
+          <wp:anchor distT="0" distB="0" distL="114300" distR="114300" simplePos="0" relativeHeight="251660288" behindDoc="0" locked="0" layoutInCell="1" allowOverlap="1" wp14:anchorId="2CA4DD5F" wp14:editId="6ADF58BF">
             <wp:simplePos x="0" y="0"/>
             <wp:positionH relativeFrom="page">
               <wp:align>left</wp:align>
@@ -1040,8 +273,8 @@
             <wp:positionV relativeFrom="paragraph">
               <wp:posOffset>-513867</wp:posOffset>
             </wp:positionV>
-            <wp:extent cx="2196252" cy="790042"/>
-            <wp:effectExtent l="0" t="0" r="0" b="0"/>
+            <wp:extent cx="2195830" cy="689810"/>
+            <wp:effectExtent l="0" t="0" r="1270" b="0"/>
             <wp:wrapNone/>
             <wp:docPr id="1500709034" name="Picture 1" descr="A logo for a pastry company&#10;&#10;Description automatically generated"/>
             <wp:cNvGraphicFramePr>
@@ -1069,7 +302,7 @@
                   <pic:spPr>
                     <a:xfrm>
                       <a:off x="0" y="0"/>
-                      <a:ext cx="2196252" cy="790042"/>
+                      <a:ext cx="2202959" cy="692050"/>
                     </a:xfrm>
                     <a:prstGeom prst="rect">
                       <a:avLst/>
@@ -1094,7 +327,163 @@
         <mc:AlternateContent>
           <mc:Choice Requires="wps">
             <w:drawing>
-              <wp:anchor distT="0" distB="0" distL="114300" distR="114300" simplePos="0" relativeHeight="251659264" behindDoc="0" locked="0" layoutInCell="1" allowOverlap="1" wp14:anchorId="1BCC5F44" wp14:editId="20F92549">
+              <wp:anchor distT="0" distB="0" distL="114300" distR="114300" simplePos="0" relativeHeight="251661312" behindDoc="0" locked="0" layoutInCell="1" allowOverlap="1" wp14:anchorId="62C9FD0E" wp14:editId="1140B8E1">
+                <wp:simplePos x="0" y="0"/>
+                <wp:positionH relativeFrom="page">
+                  <wp:posOffset>1925053</wp:posOffset>
+                </wp:positionH>
+                <wp:positionV relativeFrom="paragraph">
+                  <wp:posOffset>-433137</wp:posOffset>
+                </wp:positionV>
+                <wp:extent cx="1667510" cy="665748"/>
+                <wp:effectExtent l="0" t="0" r="0" b="0"/>
+                <wp:wrapNone/>
+                <wp:docPr id="1580348420" name="Text Box 2"/>
+                <wp:cNvGraphicFramePr/>
+                <a:graphic xmlns:a="http://schemas.openxmlformats.org/drawingml/2006/main">
+                  <a:graphicData uri="http://schemas.microsoft.com/office/word/2010/wordprocessingShape">
+                    <wps:wsp>
+                      <wps:cNvSpPr txBox="1"/>
+                      <wps:spPr>
+                        <a:xfrm>
+                          <a:off x="0" y="0"/>
+                          <a:ext cx="1667510" cy="665748"/>
+                        </a:xfrm>
+                        <a:prstGeom prst="rect">
+                          <a:avLst/>
+                        </a:prstGeom>
+                        <a:solidFill>
+                          <a:schemeClr val="lt1"/>
+                        </a:solidFill>
+                        <a:ln w="6350">
+                          <a:noFill/>
+                        </a:ln>
+                      </wps:spPr>
+                      <wps:txbx>
+                        <w:txbxContent>
+                          <w:p>
+                            <w:pPr>
+                              <w:rPr>
+                                <w:rFonts w:ascii="Arial" w:hAnsi="Arial" w:cs="Arial"/>
+                                <w:sz w:val="42"/>
+                                <w:szCs w:val="42"/>
+                              </w:rPr>
+                            </w:pPr>
+                            <w:r>
+                              <w:rPr>
+                                <w:rFonts w:ascii="Arial" w:hAnsi="Arial" w:cs="Arial"/>
+                                <w:sz w:val="42"/>
+                                <w:szCs w:val="42"/>
+                              </w:rPr>
+                              <w:t xml:space="preserve">Lava </w:t>
+                            </w:r>
+                            <w:r>
+                              <w:rPr>
+                                <w:rFonts w:ascii="Arial" w:hAnsi="Arial" w:cs="Arial"/>
+                                <w:sz w:val="42"/>
+                                <w:szCs w:val="42"/>
+                              </w:rPr>
+                              <w:t>Cake 3</w:t>
+                            </w:r>
+                            <w:r>
+                              <w:rPr>
+                                <w:rFonts w:ascii="Arial" w:hAnsi="Arial" w:cs="Arial"/>
+                                <w:sz w:val="42"/>
+                                <w:szCs w:val="42"/>
+                              </w:rPr>
+                              <w:t xml:space="preserve"> </w:t>
+                            </w:r>
+                            <w:r>
+                              <w:rPr>
+                                <w:rFonts w:ascii="Arial" w:hAnsi="Arial" w:cs="Arial"/>
+                                <w:sz w:val="42"/>
+                                <w:szCs w:val="42"/>
+                              </w:rPr>
+                              <w:t>Inch</w:t>
+                            </w:r>
+                          </w:p>
+                        </w:txbxContent>
+                      </wps:txbx>
+                      <wps:bodyPr rot="0" spcFirstLastPara="0" vertOverflow="overflow" horzOverflow="overflow" vert="horz" wrap="square" lIns="91440" tIns="45720" rIns="91440" bIns="45720" numCol="1" spcCol="0" rtlCol="0" fromWordArt="0" anchor="t" anchorCtr="0" forceAA="0" compatLnSpc="1">
+                        <a:prstTxWarp prst="textNoShape">
+                          <a:avLst/>
+                        </a:prstTxWarp>
+                        <a:noAutofit/>
+                      </wps:bodyPr>
+                    </wps:wsp>
+                  </a:graphicData>
+                </a:graphic>
+                <wp14:sizeRelH relativeFrom="margin">
+                  <wp14:pctWidth>0</wp14:pctWidth>
+                </wp14:sizeRelH>
+                <wp14:sizeRelV relativeFrom="margin">
+                  <wp14:pctHeight>0</wp14:pctHeight>
+                </wp14:sizeRelV>
+              </wp:anchor>
+            </w:drawing>
+          </mc:Choice>
+          <mc:Fallback>
+            <w:pict>
+              <v:shape w14:anchorId="62C9FD0E" id="Text Box 2" o:spid="_x0000_s1027" type="#_x0000_t202" style="position:absolute;left:0;text-align:left;margin-left:151.6pt;margin-top:-34.1pt;width:131.3pt;height:52.4pt;z-index:251661312;visibility:visible;mso-wrap-style:square;mso-width-percent:0;mso-height-percent:0;mso-wrap-distance-left:9pt;mso-wrap-distance-top:0;mso-wrap-distance-right:9pt;mso-wrap-distance-bottom:0;mso-position-horizontal:absolute;mso-position-horizontal-relative:page;mso-position-vertical:absolute;mso-position-vertical-relative:text;mso-width-percent:0;mso-height-percent:0;mso-width-relative:margin;mso-height-relative:margin;v-text-anchor:top" o:gfxdata="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" fillcolor="white [3201]" stroked="f" strokeweight=".5pt">
+                <v:textbox>
+                  <w:txbxContent>
+                    <w:p>
+                      <w:pPr>
+                        <w:rPr>
+                          <w:rFonts w:ascii="Arial" w:hAnsi="Arial" w:cs="Arial"/>
+                          <w:sz w:val="42"/>
+                          <w:szCs w:val="42"/>
+                        </w:rPr>
+                      </w:pPr>
+                      <w:r>
+                        <w:rPr>
+                          <w:rFonts w:ascii="Arial" w:hAnsi="Arial" w:cs="Arial"/>
+                          <w:sz w:val="42"/>
+                          <w:szCs w:val="42"/>
+                        </w:rPr>
+                        <w:t xml:space="preserve">Lava </w:t>
+                      </w:r>
+                      <w:r>
+                        <w:rPr>
+                          <w:rFonts w:ascii="Arial" w:hAnsi="Arial" w:cs="Arial"/>
+                          <w:sz w:val="42"/>
+                          <w:szCs w:val="42"/>
+                        </w:rPr>
+                        <w:t>Cake 3</w:t>
+                      </w:r>
+                      <w:r>
+                        <w:rPr>
+                          <w:rFonts w:ascii="Arial" w:hAnsi="Arial" w:cs="Arial"/>
+                          <w:sz w:val="42"/>
+                          <w:szCs w:val="42"/>
+                        </w:rPr>
+                        <w:t xml:space="preserve"> </w:t>
+                      </w:r>
+                      <w:r>
+                        <w:rPr>
+                          <w:rFonts w:ascii="Arial" w:hAnsi="Arial" w:cs="Arial"/>
+                          <w:sz w:val="42"/>
+                          <w:szCs w:val="42"/>
+                        </w:rPr>
+                        <w:t>Inch</w:t>
+                      </w:r>
+                    </w:p>
+                  </w:txbxContent>
+                </v:textbox>
+                <w10:wrap anchorx="page"/>
+              </v:shape>
+            </w:pict>
+          </mc:Fallback>
+        </mc:AlternateContent>
+      </w:r>
+      <w:r>
+        <w:rPr>
+          <w:noProof/>
+        </w:rPr>
+        <mc:AlternateContent>
+          <mc:Choice Requires="wps">
+            <w:drawing>
+              <wp:anchor distT="0" distB="0" distL="114300" distR="114300" simplePos="0" relativeHeight="251659264" behindDoc="0" locked="0" layoutInCell="1" allowOverlap="1" wp14:anchorId="1BCC5F44" wp14:editId="582AD797">
                 <wp:simplePos x="0" y="0"/>
                 <wp:positionH relativeFrom="column">
                   <wp:posOffset>1271930</wp:posOffset>
@@ -1212,6 +601,8 @@
           </mc:Fallback>
         </mc:AlternateContent>
       </w:r>
+    </w:p>
+    <w:p>
       <w:r>
         <w:rPr>
           <w:noProof/>
@@ -1219,16 +610,16 @@
         <mc:AlternateContent>
           <mc:Choice Requires="wps">
             <w:drawing>
-              <wp:anchor distT="0" distB="0" distL="114300" distR="114300" simplePos="0" relativeHeight="251663360" behindDoc="0" locked="0" layoutInCell="1" allowOverlap="1" wp14:anchorId="05225A93" wp14:editId="7A4D64B1">
+              <wp:anchor distT="0" distB="0" distL="114300" distR="114300" simplePos="0" relativeHeight="251663360" behindDoc="0" locked="0" layoutInCell="1" allowOverlap="1" wp14:anchorId="05225A93" wp14:editId="09061455">
                 <wp:simplePos x="0" y="0"/>
                 <wp:positionH relativeFrom="column">
-                  <wp:posOffset>1469923</wp:posOffset>
+                  <wp:posOffset>1469390</wp:posOffset>
                 </wp:positionH>
                 <wp:positionV relativeFrom="paragraph">
-                  <wp:posOffset>504139</wp:posOffset>
+                  <wp:posOffset>66274</wp:posOffset>
                 </wp:positionV>
-                <wp:extent cx="1031443" cy="636422"/>
-                <wp:effectExtent l="0" t="0" r="16510" b="11430"/>
+                <wp:extent cx="1031240" cy="636270"/>
+                <wp:effectExtent l="0" t="0" r="10160" b="11430"/>
                 <wp:wrapNone/>
                 <wp:docPr id="23066480" name="Text Box 4"/>
                 <wp:cNvGraphicFramePr/>
@@ -1239,7 +630,7 @@
                       <wps:spPr>
                         <a:xfrm>
                           <a:off x="0" y="0"/>
-                          <a:ext cx="1031443" cy="636422"/>
+                          <a:ext cx="1031240" cy="636270"/>
                         </a:xfrm>
                         <a:prstGeom prst="rect">
                           <a:avLst/>
@@ -1311,7 +702,7 @@
           </mc:Choice>
           <mc:Fallback>
             <w:pict>
-              <v:shape w14:anchorId="05225A93" id="Text Box 4" o:spid="_x0000_s1029" type="#_x0000_t202" style="position:absolute;left:0;text-align:left;margin-left:115.75pt;margin-top:39.7pt;width:81.2pt;height:50.1pt;z-index:251663360;visibility:visible;mso-wrap-style:square;mso-width-percent:0;mso-wrap-distance-left:9pt;mso-wrap-distance-top:0;mso-wrap-distance-right:9pt;mso-wrap-distance-bottom:0;mso-position-horizontal:absolute;mso-position-horizontal-relative:text;mso-position-vertical:absolute;mso-position-vertical-relative:text;mso-width-percent:0;mso-width-relative:margin;v-text-anchor:top" o:gfxdata="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" fillcolor="white [3201]" strokeweight="1pt">
+              <v:shape w14:anchorId="05225A93" id="Text Box 4" o:spid="_x0000_s1029" type="#_x0000_t202" style="position:absolute;margin-left:115.7pt;margin-top:5.2pt;width:81.2pt;height:50.1pt;z-index:251663360;visibility:visible;mso-wrap-style:square;mso-width-percent:0;mso-wrap-distance-left:9pt;mso-wrap-distance-top:0;mso-wrap-distance-right:9pt;mso-wrap-distance-bottom:0;mso-position-horizontal:absolute;mso-position-horizontal-relative:text;mso-position-vertical:absolute;mso-position-vertical-relative:text;mso-width-percent:0;mso-width-relative:margin;v-text-anchor:top" o:gfxdata="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" fillcolor="white [3201]" strokeweight="1pt">
                 <v:textbox>
                   <w:txbxContent>
                     <w:p>
@@ -1358,6 +749,10 @@
           </mc:Fallback>
         </mc:AlternateContent>
       </w:r>
+    </w:p>
+    <w:p/>
+    <w:p/>
+    <w:p>
       <w:r>
         <w:rPr>
           <w:noProof/>
@@ -1365,18 +760,18 @@
         <mc:AlternateContent>
           <mc:Choice Requires="wps">
             <w:drawing>
-              <wp:anchor distT="0" distB="0" distL="114300" distR="114300" simplePos="0" relativeHeight="251661312" behindDoc="0" locked="0" layoutInCell="1" allowOverlap="1" wp14:anchorId="62C9FD0E" wp14:editId="6DC17751">
+              <wp:anchor distT="0" distB="0" distL="114300" distR="114300" simplePos="0" relativeHeight="251664384" behindDoc="0" locked="0" layoutInCell="1" allowOverlap="1" wp14:anchorId="0DEE5C9D" wp14:editId="1EAF254E">
                 <wp:simplePos x="0" y="0"/>
-                <wp:positionH relativeFrom="page">
-                  <wp:posOffset>1922272</wp:posOffset>
+                <wp:positionH relativeFrom="column">
+                  <wp:posOffset>-697832</wp:posOffset>
                 </wp:positionH>
                 <wp:positionV relativeFrom="paragraph">
-                  <wp:posOffset>-429590</wp:posOffset>
+                  <wp:posOffset>162393</wp:posOffset>
                 </wp:positionV>
-                <wp:extent cx="1667510" cy="840740"/>
-                <wp:effectExtent l="0" t="0" r="8890" b="0"/>
+                <wp:extent cx="3211195" cy="2013284"/>
+                <wp:effectExtent l="0" t="0" r="14605" b="19050"/>
                 <wp:wrapNone/>
-                <wp:docPr id="1580348420" name="Text Box 2"/>
+                <wp:docPr id="1336787459" name="Text Box 5"/>
                 <wp:cNvGraphicFramePr/>
                 <a:graphic xmlns:a="http://schemas.openxmlformats.org/drawingml/2006/main">
                   <a:graphicData uri="http://schemas.microsoft.com/office/word/2010/wordprocessingShape">
@@ -1385,7 +780,7 @@
                       <wps:spPr>
                         <a:xfrm>
                           <a:off x="0" y="0"/>
-                          <a:ext cx="1667510" cy="840740"/>
+                          <a:ext cx="3211195" cy="2013284"/>
                         </a:xfrm>
                         <a:prstGeom prst="rect">
                           <a:avLst/>
@@ -1393,8 +788,10 @@
                         <a:solidFill>
                           <a:schemeClr val="lt1"/>
                         </a:solidFill>
-                        <a:ln w="6350">
-                          <a:noFill/>
+                        <a:ln w="12700">
+                          <a:solidFill>
+                            <a:prstClr val="black"/>
+                          </a:solidFill>
                         </a:ln>
                       </wps:spPr>
                       <wps:txbx>
@@ -1403,41 +800,346 @@
                             <w:pPr>
                               <w:rPr>
                                 <w:rFonts w:ascii="Arial" w:hAnsi="Arial" w:cs="Arial"/>
-                                <w:sz w:val="42"/>
-                                <w:szCs w:val="42"/>
+                                <w:sz w:val="20"/>
+                                <w:szCs w:val="20"/>
                               </w:rPr>
                             </w:pPr>
                             <w:r>
                               <w:rPr>
                                 <w:rFonts w:ascii="Arial" w:hAnsi="Arial" w:cs="Arial"/>
-                                <w:sz w:val="42"/>
-                                <w:szCs w:val="42"/>
-                              </w:rPr>
-                              <w:t xml:space="preserve">Lava </w:t>
-                            </w:r>
-                            <w:r>
-                              <w:rPr>
-                                <w:rFonts w:ascii="Arial" w:hAnsi="Arial" w:cs="Arial"/>
-                                <w:sz w:val="42"/>
-                                <w:szCs w:val="42"/>
-                              </w:rPr>
-                              <w:t>Cake 3</w:t>
-                            </w:r>
-                            <w:r>
-                              <w:rPr>
-                                <w:rFonts w:ascii="Arial" w:hAnsi="Arial" w:cs="Arial"/>
-                                <w:sz w:val="42"/>
-                                <w:szCs w:val="42"/>
+                                <w:b/>
+                                <w:bCs/>
+                                <w:sz w:val="20"/>
+                                <w:szCs w:val="20"/>
+                              </w:rPr>
+                              <w:t>Ingredients:</w:t>
+                            </w:r>
+                            <w:r>
+                              <w:rPr>
+                                <w:sz w:val="20"/>
+                                <w:szCs w:val="20"/>
                               </w:rPr>
                               <w:t xml:space="preserve"> </w:t>
                             </w:r>
                             <w:r>
                               <w:rPr>
                                 <w:rFonts w:ascii="Arial" w:hAnsi="Arial" w:cs="Arial"/>
-                                <w:sz w:val="42"/>
-                                <w:szCs w:val="42"/>
-                              </w:rPr>
-                              <w:t>Inch</w:t>
+                                <w:sz w:val="20"/>
+                                <w:szCs w:val="20"/>
+                              </w:rPr>
+                              <w:t>Eggs, sugar, wheat flour, margarine (modified palm oil,</w:t>
+                            </w:r>
+                            <w:r>
+                              <w:rPr>
+                                <w:rFonts w:ascii="Arial" w:hAnsi="Arial" w:cs="Arial"/>
+                                <w:sz w:val="20"/>
+                                <w:szCs w:val="20"/>
+                              </w:rPr>
+                              <w:t xml:space="preserve"> </w:t>
+                            </w:r>
+                            <w:r>
+                              <w:rPr>
+                                <w:rFonts w:ascii="Arial" w:hAnsi="Arial" w:cs="Arial"/>
+                                <w:sz w:val="20"/>
+                                <w:szCs w:val="20"/>
+                              </w:rPr>
+                              <w:t>water, monoglycerides, potassium sorbate,</w:t>
+                            </w:r>
+                            <w:r>
+                              <w:rPr>
+                                <w:rFonts w:ascii="Arial" w:hAnsi="Arial" w:cs="Arial"/>
+                                <w:sz w:val="20"/>
+                                <w:szCs w:val="20"/>
+                              </w:rPr>
+                              <w:t xml:space="preserve"> </w:t>
+                            </w:r>
+                            <w:proofErr w:type="spellStart"/>
+                            <w:r>
+                              <w:rPr>
+                                <w:rFonts w:ascii="Arial" w:hAnsi="Arial" w:cs="Arial"/>
+                                <w:sz w:val="20"/>
+                                <w:szCs w:val="20"/>
+                              </w:rPr>
+                              <w:t>citirc</w:t>
+                            </w:r>
+                            <w:proofErr w:type="spellEnd"/>
+                            <w:r>
+                              <w:rPr>
+                                <w:rFonts w:ascii="Arial" w:hAnsi="Arial" w:cs="Arial"/>
+                                <w:sz w:val="20"/>
+                                <w:szCs w:val="20"/>
+                              </w:rPr>
+                              <w:t xml:space="preserve"> acid, natural flavor,</w:t>
+                            </w:r>
+                            <w:r>
+                              <w:rPr>
+                                <w:rFonts w:ascii="Arial" w:hAnsi="Arial" w:cs="Arial"/>
+                                <w:sz w:val="20"/>
+                                <w:szCs w:val="20"/>
+                              </w:rPr>
+                              <w:t xml:space="preserve"> </w:t>
+                            </w:r>
+                            <w:r>
+                              <w:rPr>
+                                <w:rFonts w:ascii="Arial" w:hAnsi="Arial" w:cs="Arial"/>
+                                <w:sz w:val="20"/>
+                                <w:szCs w:val="20"/>
+                              </w:rPr>
+                              <w:t>vitamin A palmitate,</w:t>
+                            </w:r>
+                            <w:r>
+                              <w:rPr>
+                                <w:rFonts w:ascii="Arial" w:hAnsi="Arial" w:cs="Arial"/>
+                                <w:sz w:val="20"/>
+                                <w:szCs w:val="20"/>
+                              </w:rPr>
+                              <w:t xml:space="preserve"> </w:t>
+                            </w:r>
+                            <w:r>
+                              <w:rPr>
+                                <w:rFonts w:ascii="Arial" w:hAnsi="Arial" w:cs="Arial"/>
+                                <w:sz w:val="20"/>
+                                <w:szCs w:val="20"/>
+                              </w:rPr>
+                              <w:t>vitamin D3)</w:t>
+                            </w:r>
+                            <w:r>
+                              <w:rPr>
+                                <w:rFonts w:ascii="Arial" w:hAnsi="Arial" w:cs="Arial"/>
+                                <w:sz w:val="20"/>
+                                <w:szCs w:val="20"/>
+                              </w:rPr>
+                              <w:t xml:space="preserve"> </w:t>
+                            </w:r>
+                            <w:r>
+                              <w:rPr>
+                                <w:rFonts w:ascii="Arial" w:hAnsi="Arial" w:cs="Arial"/>
+                                <w:sz w:val="20"/>
+                                <w:szCs w:val="20"/>
+                              </w:rPr>
+                              <w:t>Dark Chocolate</w:t>
+                            </w:r>
+                            <w:r>
+                              <w:rPr>
+                                <w:rFonts w:ascii="Arial" w:hAnsi="Arial" w:cs="Arial"/>
+                                <w:sz w:val="20"/>
+                                <w:szCs w:val="20"/>
+                              </w:rPr>
+                              <w:t xml:space="preserve"> </w:t>
+                            </w:r>
+                            <w:r>
+                              <w:rPr>
+                                <w:rFonts w:ascii="Arial" w:hAnsi="Arial" w:cs="Arial"/>
+                                <w:sz w:val="20"/>
+                                <w:szCs w:val="20"/>
+                              </w:rPr>
+                              <w:t>(sugar,</w:t>
+                            </w:r>
+                            <w:r>
+                              <w:rPr>
+                                <w:rFonts w:ascii="Arial" w:hAnsi="Arial" w:cs="Arial"/>
+                                <w:sz w:val="20"/>
+                                <w:szCs w:val="20"/>
+                              </w:rPr>
+                              <w:t xml:space="preserve"> </w:t>
+                            </w:r>
+                            <w:r>
+                              <w:rPr>
+                                <w:rFonts w:ascii="Arial" w:hAnsi="Arial" w:cs="Arial"/>
+                                <w:sz w:val="20"/>
+                                <w:szCs w:val="20"/>
+                              </w:rPr>
+                              <w:t>cocoa butter,</w:t>
+                            </w:r>
+                            <w:r>
+                              <w:rPr>
+                                <w:rFonts w:ascii="Arial" w:hAnsi="Arial" w:cs="Arial"/>
+                                <w:sz w:val="20"/>
+                                <w:szCs w:val="20"/>
+                              </w:rPr>
+                              <w:t xml:space="preserve"> </w:t>
+                            </w:r>
+                            <w:proofErr w:type="spellStart"/>
+                            <w:r>
+                              <w:rPr>
+                                <w:rFonts w:ascii="Arial" w:hAnsi="Arial" w:cs="Arial"/>
+                                <w:sz w:val="20"/>
+                                <w:szCs w:val="20"/>
+                              </w:rPr>
+                              <w:t>blegian</w:t>
+                            </w:r>
+                            <w:proofErr w:type="spellEnd"/>
+                            <w:r>
+                              <w:rPr>
+                                <w:rFonts w:ascii="Arial" w:hAnsi="Arial" w:cs="Arial"/>
+                                <w:sz w:val="20"/>
+                                <w:szCs w:val="20"/>
+                              </w:rPr>
+                              <w:t xml:space="preserve"> unsweetened chocolate,</w:t>
+                            </w:r>
+                            <w:r>
+                              <w:rPr>
+                                <w:rFonts w:ascii="Arial" w:hAnsi="Arial" w:cs="Arial"/>
+                                <w:sz w:val="20"/>
+                                <w:szCs w:val="20"/>
+                              </w:rPr>
+                              <w:t xml:space="preserve"> </w:t>
+                            </w:r>
+                            <w:r>
+                              <w:rPr>
+                                <w:rFonts w:ascii="Arial" w:hAnsi="Arial" w:cs="Arial"/>
+                                <w:sz w:val="20"/>
+                                <w:szCs w:val="20"/>
+                              </w:rPr>
+                              <w:t xml:space="preserve">soy </w:t>
+                            </w:r>
+                            <w:proofErr w:type="spellStart"/>
+                            <w:r>
+                              <w:rPr>
+                                <w:rFonts w:ascii="Arial" w:hAnsi="Arial" w:cs="Arial"/>
+                                <w:sz w:val="20"/>
+                                <w:szCs w:val="20"/>
+                              </w:rPr>
+                              <w:t>licithin</w:t>
+                            </w:r>
+                            <w:proofErr w:type="spellEnd"/>
+                            <w:r>
+                              <w:rPr>
+                                <w:rFonts w:ascii="Arial" w:hAnsi="Arial" w:cs="Arial"/>
+                                <w:sz w:val="20"/>
+                                <w:szCs w:val="20"/>
+                              </w:rPr>
+                              <w:t>,</w:t>
+                            </w:r>
+                            <w:r>
+                              <w:rPr>
+                                <w:rFonts w:ascii="Arial" w:hAnsi="Arial" w:cs="Arial"/>
+                                <w:sz w:val="20"/>
+                                <w:szCs w:val="20"/>
+                              </w:rPr>
+                              <w:t xml:space="preserve"> </w:t>
+                            </w:r>
+                            <w:r>
+                              <w:rPr>
+                                <w:rFonts w:ascii="Arial" w:hAnsi="Arial" w:cs="Arial"/>
+                                <w:sz w:val="20"/>
+                                <w:szCs w:val="20"/>
+                              </w:rPr>
+                              <w:t xml:space="preserve">natural </w:t>
+                            </w:r>
+                            <w:proofErr w:type="spellStart"/>
+                            <w:r>
+                              <w:rPr>
+                                <w:rFonts w:ascii="Arial" w:hAnsi="Arial" w:cs="Arial"/>
+                                <w:sz w:val="20"/>
+                                <w:szCs w:val="20"/>
+                              </w:rPr>
+                              <w:t>anilla</w:t>
+                            </w:r>
+                            <w:proofErr w:type="spellEnd"/>
+                            <w:r>
+                              <w:rPr>
+                                <w:rFonts w:ascii="Arial" w:hAnsi="Arial" w:cs="Arial"/>
+                                <w:sz w:val="20"/>
+                                <w:szCs w:val="20"/>
+                              </w:rPr>
+                              <w:t xml:space="preserve"> extract) stabilizer,</w:t>
+                            </w:r>
+                            <w:r>
+                              <w:rPr>
+                                <w:rFonts w:ascii="Arial" w:hAnsi="Arial" w:cs="Arial"/>
+                                <w:sz w:val="20"/>
+                                <w:szCs w:val="20"/>
+                              </w:rPr>
+                              <w:t xml:space="preserve"> </w:t>
+                            </w:r>
+                            <w:r>
+                              <w:rPr>
+                                <w:rFonts w:ascii="Arial" w:hAnsi="Arial" w:cs="Arial"/>
+                                <w:sz w:val="20"/>
+                                <w:szCs w:val="20"/>
+                              </w:rPr>
+                              <w:t xml:space="preserve">coating </w:t>
+                            </w:r>
+                            <w:proofErr w:type="gramStart"/>
+                            <w:r>
+                              <w:rPr>
+                                <w:rFonts w:ascii="Arial" w:hAnsi="Arial" w:cs="Arial"/>
+                                <w:sz w:val="20"/>
+                                <w:szCs w:val="20"/>
+                              </w:rPr>
+                              <w:t>chocolate(</w:t>
+                            </w:r>
+                            <w:proofErr w:type="gramEnd"/>
+                            <w:r>
+                              <w:rPr>
+                                <w:rFonts w:ascii="Arial" w:hAnsi="Arial" w:cs="Arial"/>
+                                <w:sz w:val="20"/>
+                                <w:szCs w:val="20"/>
+                              </w:rPr>
+                              <w:t>sugar,</w:t>
+                            </w:r>
+                            <w:r>
+                              <w:rPr>
+                                <w:rFonts w:ascii="Arial" w:hAnsi="Arial" w:cs="Arial"/>
+                                <w:sz w:val="20"/>
+                                <w:szCs w:val="20"/>
+                              </w:rPr>
+                              <w:t xml:space="preserve"> </w:t>
+                            </w:r>
+                            <w:proofErr w:type="spellStart"/>
+                            <w:r>
+                              <w:rPr>
+                                <w:rFonts w:ascii="Arial" w:hAnsi="Arial" w:cs="Arial"/>
+                                <w:sz w:val="20"/>
+                                <w:szCs w:val="20"/>
+                              </w:rPr>
+                              <w:t>non hydrogenated</w:t>
+                            </w:r>
+                            <w:proofErr w:type="spellEnd"/>
+                            <w:r>
+                              <w:rPr>
+                                <w:rFonts w:ascii="Arial" w:hAnsi="Arial" w:cs="Arial"/>
+                                <w:sz w:val="20"/>
+                                <w:szCs w:val="20"/>
+                              </w:rPr>
+                              <w:t xml:space="preserve"> fats,</w:t>
+                            </w:r>
+                            <w:r>
+                              <w:rPr>
+                                <w:rFonts w:ascii="Arial" w:hAnsi="Arial" w:cs="Arial"/>
+                                <w:sz w:val="20"/>
+                                <w:szCs w:val="20"/>
+                              </w:rPr>
+                              <w:t xml:space="preserve"> </w:t>
+                            </w:r>
+                            <w:proofErr w:type="spellStart"/>
+                            <w:proofErr w:type="gramStart"/>
+                            <w:r>
+                              <w:rPr>
+                                <w:rFonts w:ascii="Arial" w:hAnsi="Arial" w:cs="Arial"/>
+                                <w:sz w:val="20"/>
+                                <w:szCs w:val="20"/>
+                              </w:rPr>
+                              <w:t>smulsifier</w:t>
+                            </w:r>
+                            <w:proofErr w:type="spellEnd"/>
+                            <w:r>
+                              <w:rPr>
+                                <w:rFonts w:ascii="Arial" w:hAnsi="Arial" w:cs="Arial"/>
+                                <w:sz w:val="20"/>
+                                <w:szCs w:val="20"/>
+                              </w:rPr>
+                              <w:t xml:space="preserve"> ,coco</w:t>
+                            </w:r>
+                            <w:proofErr w:type="gramEnd"/>
+                            <w:r>
+                              <w:rPr>
+                                <w:rFonts w:ascii="Arial" w:hAnsi="Arial" w:cs="Arial"/>
+                                <w:sz w:val="20"/>
+                                <w:szCs w:val="20"/>
+                              </w:rPr>
+                              <w:t xml:space="preserve"> powder).</w:t>
                             </w:r>
                           </w:p>
                         </w:txbxContent>
@@ -1454,68 +1156,371 @@
                 <wp14:sizeRelH relativeFrom="margin">
                   <wp14:pctWidth>0</wp14:pctWidth>
                 </wp14:sizeRelH>
+                <wp14:sizeRelV relativeFrom="margin">
+                  <wp14:pctHeight>0</wp14:pctHeight>
+                </wp14:sizeRelV>
               </wp:anchor>
             </w:drawing>
           </mc:Choice>
           <mc:Fallback>
             <w:pict>
-              <v:shape w14:anchorId="62C9FD0E" id="Text Box 2" o:spid="_x0000_s1030" type="#_x0000_t202" style="position:absolute;left:0;text-align:left;margin-left:151.35pt;margin-top:-33.85pt;width:131.3pt;height:66.2pt;z-index:251661312;visibility:visible;mso-wrap-style:square;mso-width-percent:0;mso-wrap-distance-left:9pt;mso-wrap-distance-top:0;mso-wrap-distance-right:9pt;mso-wrap-distance-bottom:0;mso-position-horizontal:absolute;mso-position-horizontal-relative:page;mso-position-vertical:absolute;mso-position-vertical-relative:text;mso-width-percent:0;mso-width-relative:margin;v-text-anchor:top" o:gfxdata="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" fillcolor="white [3201]" stroked="f" strokeweight=".5pt">
+              <v:shape w14:anchorId="0DEE5C9D" id="Text Box 5" o:spid="_x0000_s1030" type="#_x0000_t202" style="position:absolute;margin-left:-54.95pt;margin-top:12.8pt;width:252.85pt;height:158.55pt;z-index:251664384;visibility:visible;mso-wrap-style:square;mso-width-percent:0;mso-height-percent:0;mso-wrap-distance-left:9pt;mso-wrap-distance-top:0;mso-wrap-distance-right:9pt;mso-wrap-distance-bottom:0;mso-position-horizontal:absolute;mso-position-horizontal-relative:text;mso-position-vertical:absolute;mso-position-vertical-relative:text;mso-width-percent:0;mso-height-percent:0;mso-width-relative:margin;mso-height-relative:margin;v-text-anchor:top" o:gfxdata="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" fillcolor="white [3201]" strokeweight="1pt">
                 <v:textbox>
                   <w:txbxContent>
                     <w:p>
                       <w:pPr>
                         <w:rPr>
                           <w:rFonts w:ascii="Arial" w:hAnsi="Arial" w:cs="Arial"/>
-                          <w:sz w:val="42"/>
-                          <w:szCs w:val="42"/>
+                          <w:sz w:val="20"/>
+                          <w:szCs w:val="20"/>
                         </w:rPr>
                       </w:pPr>
                       <w:r>
                         <w:rPr>
                           <w:rFonts w:ascii="Arial" w:hAnsi="Arial" w:cs="Arial"/>
-                          <w:sz w:val="42"/>
-                          <w:szCs w:val="42"/>
-                        </w:rPr>
-                        <w:t xml:space="preserve">Lava </w:t>
-                      </w:r>
-                      <w:r>
-                        <w:rPr>
-                          <w:rFonts w:ascii="Arial" w:hAnsi="Arial" w:cs="Arial"/>
-                          <w:sz w:val="42"/>
-                          <w:szCs w:val="42"/>
-                        </w:rPr>
-                        <w:t>Cake 3</w:t>
-                      </w:r>
-                      <w:r>
-                        <w:rPr>
-                          <w:rFonts w:ascii="Arial" w:hAnsi="Arial" w:cs="Arial"/>
-                          <w:sz w:val="42"/>
-                          <w:szCs w:val="42"/>
+                          <w:b/>
+                          <w:bCs/>
+                          <w:sz w:val="20"/>
+                          <w:szCs w:val="20"/>
+                        </w:rPr>
+                        <w:t>Ingredients:</w:t>
+                      </w:r>
+                      <w:r>
+                        <w:rPr>
+                          <w:sz w:val="20"/>
+                          <w:szCs w:val="20"/>
                         </w:rPr>
                         <w:t xml:space="preserve"> </w:t>
                       </w:r>
                       <w:r>
                         <w:rPr>
                           <w:rFonts w:ascii="Arial" w:hAnsi="Arial" w:cs="Arial"/>
-                          <w:sz w:val="42"/>
-                          <w:szCs w:val="42"/>
-                        </w:rPr>
-                        <w:t>Inch</w:t>
+                          <w:sz w:val="20"/>
+                          <w:szCs w:val="20"/>
+                        </w:rPr>
+                        <w:t>Eggs, sugar, wheat flour, margarine (modified palm oil,</w:t>
+                      </w:r>
+                      <w:r>
+                        <w:rPr>
+                          <w:rFonts w:ascii="Arial" w:hAnsi="Arial" w:cs="Arial"/>
+                          <w:sz w:val="20"/>
+                          <w:szCs w:val="20"/>
+                        </w:rPr>
+                        <w:t xml:space="preserve"> </w:t>
+                      </w:r>
+                      <w:r>
+                        <w:rPr>
+                          <w:rFonts w:ascii="Arial" w:hAnsi="Arial" w:cs="Arial"/>
+                          <w:sz w:val="20"/>
+                          <w:szCs w:val="20"/>
+                        </w:rPr>
+                        <w:t>water, monoglycerides, potassium sorbate,</w:t>
+                      </w:r>
+                      <w:r>
+                        <w:rPr>
+                          <w:rFonts w:ascii="Arial" w:hAnsi="Arial" w:cs="Arial"/>
+                          <w:sz w:val="20"/>
+                          <w:szCs w:val="20"/>
+                        </w:rPr>
+                        <w:t xml:space="preserve"> </w:t>
+                      </w:r>
+                      <w:proofErr w:type="spellStart"/>
+                      <w:r>
+                        <w:rPr>
+                          <w:rFonts w:ascii="Arial" w:hAnsi="Arial" w:cs="Arial"/>
+                          <w:sz w:val="20"/>
+                          <w:szCs w:val="20"/>
+                        </w:rPr>
+                        <w:t>citirc</w:t>
+                      </w:r>
+                      <w:proofErr w:type="spellEnd"/>
+                      <w:r>
+                        <w:rPr>
+                          <w:rFonts w:ascii="Arial" w:hAnsi="Arial" w:cs="Arial"/>
+                          <w:sz w:val="20"/>
+                          <w:szCs w:val="20"/>
+                        </w:rPr>
+                        <w:t xml:space="preserve"> acid, natural flavor,</w:t>
+                      </w:r>
+                      <w:r>
+                        <w:rPr>
+                          <w:rFonts w:ascii="Arial" w:hAnsi="Arial" w:cs="Arial"/>
+                          <w:sz w:val="20"/>
+                          <w:szCs w:val="20"/>
+                        </w:rPr>
+                        <w:t xml:space="preserve"> </w:t>
+                      </w:r>
+                      <w:r>
+                        <w:rPr>
+                          <w:rFonts w:ascii="Arial" w:hAnsi="Arial" w:cs="Arial"/>
+                          <w:sz w:val="20"/>
+                          <w:szCs w:val="20"/>
+                        </w:rPr>
+                        <w:t>vitamin A palmitate,</w:t>
+                      </w:r>
+                      <w:r>
+                        <w:rPr>
+                          <w:rFonts w:ascii="Arial" w:hAnsi="Arial" w:cs="Arial"/>
+                          <w:sz w:val="20"/>
+                          <w:szCs w:val="20"/>
+                        </w:rPr>
+                        <w:t xml:space="preserve"> </w:t>
+                      </w:r>
+                      <w:r>
+                        <w:rPr>
+                          <w:rFonts w:ascii="Arial" w:hAnsi="Arial" w:cs="Arial"/>
+                          <w:sz w:val="20"/>
+                          <w:szCs w:val="20"/>
+                        </w:rPr>
+                        <w:t>vitamin D3)</w:t>
+                      </w:r>
+                      <w:r>
+                        <w:rPr>
+                          <w:rFonts w:ascii="Arial" w:hAnsi="Arial" w:cs="Arial"/>
+                          <w:sz w:val="20"/>
+                          <w:szCs w:val="20"/>
+                        </w:rPr>
+                        <w:t xml:space="preserve"> </w:t>
+                      </w:r>
+                      <w:r>
+                        <w:rPr>
+                          <w:rFonts w:ascii="Arial" w:hAnsi="Arial" w:cs="Arial"/>
+                          <w:sz w:val="20"/>
+                          <w:szCs w:val="20"/>
+                        </w:rPr>
+                        <w:t>Dark Chocolate</w:t>
+                      </w:r>
+                      <w:r>
+                        <w:rPr>
+                          <w:rFonts w:ascii="Arial" w:hAnsi="Arial" w:cs="Arial"/>
+                          <w:sz w:val="20"/>
+                          <w:szCs w:val="20"/>
+                        </w:rPr>
+                        <w:t xml:space="preserve"> </w:t>
+                      </w:r>
+                      <w:r>
+                        <w:rPr>
+                          <w:rFonts w:ascii="Arial" w:hAnsi="Arial" w:cs="Arial"/>
+                          <w:sz w:val="20"/>
+                          <w:szCs w:val="20"/>
+                        </w:rPr>
+                        <w:t>(sugar,</w:t>
+                      </w:r>
+                      <w:r>
+                        <w:rPr>
+                          <w:rFonts w:ascii="Arial" w:hAnsi="Arial" w:cs="Arial"/>
+                          <w:sz w:val="20"/>
+                          <w:szCs w:val="20"/>
+                        </w:rPr>
+                        <w:t xml:space="preserve"> </w:t>
+                      </w:r>
+                      <w:r>
+                        <w:rPr>
+                          <w:rFonts w:ascii="Arial" w:hAnsi="Arial" w:cs="Arial"/>
+                          <w:sz w:val="20"/>
+                          <w:szCs w:val="20"/>
+                        </w:rPr>
+                        <w:t>cocoa butter,</w:t>
+                      </w:r>
+                      <w:r>
+                        <w:rPr>
+                          <w:rFonts w:ascii="Arial" w:hAnsi="Arial" w:cs="Arial"/>
+                          <w:sz w:val="20"/>
+                          <w:szCs w:val="20"/>
+                        </w:rPr>
+                        <w:t xml:space="preserve"> </w:t>
+                      </w:r>
+                      <w:proofErr w:type="spellStart"/>
+                      <w:r>
+                        <w:rPr>
+                          <w:rFonts w:ascii="Arial" w:hAnsi="Arial" w:cs="Arial"/>
+                          <w:sz w:val="20"/>
+                          <w:szCs w:val="20"/>
+                        </w:rPr>
+                        <w:t>blegian</w:t>
+                      </w:r>
+                      <w:proofErr w:type="spellEnd"/>
+                      <w:r>
+                        <w:rPr>
+                          <w:rFonts w:ascii="Arial" w:hAnsi="Arial" w:cs="Arial"/>
+                          <w:sz w:val="20"/>
+                          <w:szCs w:val="20"/>
+                        </w:rPr>
+                        <w:t xml:space="preserve"> unsweetened chocolate,</w:t>
+                      </w:r>
+                      <w:r>
+                        <w:rPr>
+                          <w:rFonts w:ascii="Arial" w:hAnsi="Arial" w:cs="Arial"/>
+                          <w:sz w:val="20"/>
+                          <w:szCs w:val="20"/>
+                        </w:rPr>
+                        <w:t xml:space="preserve"> </w:t>
+                      </w:r>
+                      <w:r>
+                        <w:rPr>
+                          <w:rFonts w:ascii="Arial" w:hAnsi="Arial" w:cs="Arial"/>
+                          <w:sz w:val="20"/>
+                          <w:szCs w:val="20"/>
+                        </w:rPr>
+                        <w:t xml:space="preserve">soy </w:t>
+                      </w:r>
+                      <w:proofErr w:type="spellStart"/>
+                      <w:r>
+                        <w:rPr>
+                          <w:rFonts w:ascii="Arial" w:hAnsi="Arial" w:cs="Arial"/>
+                          <w:sz w:val="20"/>
+                          <w:szCs w:val="20"/>
+                        </w:rPr>
+                        <w:t>licithin</w:t>
+                      </w:r>
+                      <w:proofErr w:type="spellEnd"/>
+                      <w:r>
+                        <w:rPr>
+                          <w:rFonts w:ascii="Arial" w:hAnsi="Arial" w:cs="Arial"/>
+                          <w:sz w:val="20"/>
+                          <w:szCs w:val="20"/>
+                        </w:rPr>
+                        <w:t>,</w:t>
+                      </w:r>
+                      <w:r>
+                        <w:rPr>
+                          <w:rFonts w:ascii="Arial" w:hAnsi="Arial" w:cs="Arial"/>
+                          <w:sz w:val="20"/>
+                          <w:szCs w:val="20"/>
+                        </w:rPr>
+                        <w:t xml:space="preserve"> </w:t>
+                      </w:r>
+                      <w:r>
+                        <w:rPr>
+                          <w:rFonts w:ascii="Arial" w:hAnsi="Arial" w:cs="Arial"/>
+                          <w:sz w:val="20"/>
+                          <w:szCs w:val="20"/>
+                        </w:rPr>
+                        <w:t xml:space="preserve">natural </w:t>
+                      </w:r>
+                      <w:proofErr w:type="spellStart"/>
+                      <w:r>
+                        <w:rPr>
+                          <w:rFonts w:ascii="Arial" w:hAnsi="Arial" w:cs="Arial"/>
+                          <w:sz w:val="20"/>
+                          <w:szCs w:val="20"/>
+                        </w:rPr>
+                        <w:t>anilla</w:t>
+                      </w:r>
+                      <w:proofErr w:type="spellEnd"/>
+                      <w:r>
+                        <w:rPr>
+                          <w:rFonts w:ascii="Arial" w:hAnsi="Arial" w:cs="Arial"/>
+                          <w:sz w:val="20"/>
+                          <w:szCs w:val="20"/>
+                        </w:rPr>
+                        <w:t xml:space="preserve"> extract) stabilizer,</w:t>
+                      </w:r>
+                      <w:r>
+                        <w:rPr>
+                          <w:rFonts w:ascii="Arial" w:hAnsi="Arial" w:cs="Arial"/>
+                          <w:sz w:val="20"/>
+                          <w:szCs w:val="20"/>
+                        </w:rPr>
+                        <w:t xml:space="preserve"> </w:t>
+                      </w:r>
+                      <w:r>
+                        <w:rPr>
+                          <w:rFonts w:ascii="Arial" w:hAnsi="Arial" w:cs="Arial"/>
+                          <w:sz w:val="20"/>
+                          <w:szCs w:val="20"/>
+                        </w:rPr>
+                        <w:t xml:space="preserve">coating </w:t>
+                      </w:r>
+                      <w:proofErr w:type="gramStart"/>
+                      <w:r>
+                        <w:rPr>
+                          <w:rFonts w:ascii="Arial" w:hAnsi="Arial" w:cs="Arial"/>
+                          <w:sz w:val="20"/>
+                          <w:szCs w:val="20"/>
+                        </w:rPr>
+                        <w:t>chocolate(</w:t>
+                      </w:r>
+                      <w:proofErr w:type="gramEnd"/>
+                      <w:r>
+                        <w:rPr>
+                          <w:rFonts w:ascii="Arial" w:hAnsi="Arial" w:cs="Arial"/>
+                          <w:sz w:val="20"/>
+                          <w:szCs w:val="20"/>
+                        </w:rPr>
+                        <w:t>sugar,</w:t>
+                      </w:r>
+                      <w:r>
+                        <w:rPr>
+                          <w:rFonts w:ascii="Arial" w:hAnsi="Arial" w:cs="Arial"/>
+                          <w:sz w:val="20"/>
+                          <w:szCs w:val="20"/>
+                        </w:rPr>
+                        <w:t xml:space="preserve"> </w:t>
+                      </w:r>
+                      <w:proofErr w:type="spellStart"/>
+                      <w:r>
+                        <w:rPr>
+                          <w:rFonts w:ascii="Arial" w:hAnsi="Arial" w:cs="Arial"/>
+                          <w:sz w:val="20"/>
+                          <w:szCs w:val="20"/>
+                        </w:rPr>
+                        <w:t>non hydrogenated</w:t>
+                      </w:r>
+                      <w:proofErr w:type="spellEnd"/>
+                      <w:r>
+                        <w:rPr>
+                          <w:rFonts w:ascii="Arial" w:hAnsi="Arial" w:cs="Arial"/>
+                          <w:sz w:val="20"/>
+                          <w:szCs w:val="20"/>
+                        </w:rPr>
+                        <w:t xml:space="preserve"> fats,</w:t>
+                      </w:r>
+                      <w:r>
+                        <w:rPr>
+                          <w:rFonts w:ascii="Arial" w:hAnsi="Arial" w:cs="Arial"/>
+                          <w:sz w:val="20"/>
+                          <w:szCs w:val="20"/>
+                        </w:rPr>
+                        <w:t xml:space="preserve"> </w:t>
+                      </w:r>
+                      <w:proofErr w:type="spellStart"/>
+                      <w:proofErr w:type="gramStart"/>
+                      <w:r>
+                        <w:rPr>
+                          <w:rFonts w:ascii="Arial" w:hAnsi="Arial" w:cs="Arial"/>
+                          <w:sz w:val="20"/>
+                          <w:szCs w:val="20"/>
+                        </w:rPr>
+                        <w:t>smulsifier</w:t>
+                      </w:r>
+                      <w:proofErr w:type="spellEnd"/>
+                      <w:r>
+                        <w:rPr>
+                          <w:rFonts w:ascii="Arial" w:hAnsi="Arial" w:cs="Arial"/>
+                          <w:sz w:val="20"/>
+                          <w:szCs w:val="20"/>
+                        </w:rPr>
+                        <w:t xml:space="preserve"> ,coco</w:t>
+                      </w:r>
+                      <w:proofErr w:type="gramEnd"/>
+                      <w:r>
+                        <w:rPr>
+                          <w:rFonts w:ascii="Arial" w:hAnsi="Arial" w:cs="Arial"/>
+                          <w:sz w:val="20"/>
+                          <w:szCs w:val="20"/>
+                        </w:rPr>
+                        <w:t xml:space="preserve"> powder).</w:t>
                       </w:r>
                     </w:p>
                   </w:txbxContent>
                 </v:textbox>
-                <w10:wrap anchorx="page"/>
               </v:shape>
             </w:pict>
           </mc:Fallback>
         </mc:AlternateContent>
       </w:r>
     </w:p>
-    <w:p/>
-    <w:p/>
-    <w:p/>
-    <w:p/>
     <w:p/>
     <w:p/>
     <w:p/>
@@ -1530,15 +1535,15 @@
           <w:noProof/>
         </w:rPr>
         <w:drawing>
-          <wp:anchor distT="0" distB="0" distL="114300" distR="114300" simplePos="0" relativeHeight="251667456" behindDoc="0" locked="0" layoutInCell="1" allowOverlap="1" wp14:anchorId="2F11B24C" wp14:editId="5A2341B3">
+          <wp:anchor distT="0" distB="0" distL="114300" distR="114300" simplePos="0" relativeHeight="251667456" behindDoc="0" locked="0" layoutInCell="1" allowOverlap="1" wp14:anchorId="2F11B24C" wp14:editId="4036E572">
             <wp:simplePos x="0" y="0"/>
             <wp:positionH relativeFrom="column">
               <wp:posOffset>-614680</wp:posOffset>
             </wp:positionH>
             <wp:positionV relativeFrom="paragraph">
-              <wp:posOffset>222250</wp:posOffset>
+              <wp:posOffset>422041</wp:posOffset>
             </wp:positionV>
-            <wp:extent cx="3108960" cy="640080"/>
+            <wp:extent cx="3108960" cy="740410"/>
             <wp:effectExtent l="0" t="0" r="0" b="0"/>
             <wp:wrapNone/>
             <wp:docPr id="819978161" name="Picture 7"/>
@@ -1553,7 +1558,7 @@
                     <pic:cNvPicPr/>
                   </pic:nvPicPr>
                   <pic:blipFill>
-                    <a:blip r:embed="rId5">
+                    <a:blip r:embed="rId5" cstate="print">
                       <a:extLst>
                         <a:ext uri="{28A0092B-C50C-407E-A947-70E740481C1C}">
                           <a14:useLocalDpi xmlns:a14="http://schemas.microsoft.com/office/drawing/2010/main" val="0"/>
@@ -1567,7 +1572,7 @@
                   <pic:spPr>
                     <a:xfrm>
                       <a:off x="0" y="0"/>
-                      <a:ext cx="3108960" cy="640080"/>
+                      <a:ext cx="3108960" cy="740410"/>
                     </a:xfrm>
                     <a:prstGeom prst="rect">
                       <a:avLst/>
@@ -1592,13 +1597,13 @@
         <mc:AlternateContent>
           <mc:Choice Requires="wps">
             <w:drawing>
-              <wp:anchor distT="0" distB="0" distL="114300" distR="114300" simplePos="0" relativeHeight="251666432" behindDoc="0" locked="0" layoutInCell="1" allowOverlap="1" wp14:anchorId="07DCC27C" wp14:editId="0C1282DF">
+              <wp:anchor distT="0" distB="0" distL="114300" distR="114300" simplePos="0" relativeHeight="251666432" behindDoc="0" locked="0" layoutInCell="1" allowOverlap="1" wp14:anchorId="07DCC27C" wp14:editId="685D2480">
                 <wp:simplePos x="0" y="0"/>
                 <wp:positionH relativeFrom="page">
                   <wp:posOffset>487680</wp:posOffset>
                 </wp:positionH>
                 <wp:positionV relativeFrom="paragraph">
-                  <wp:posOffset>811530</wp:posOffset>
+                  <wp:posOffset>1136416</wp:posOffset>
                 </wp:positionV>
                 <wp:extent cx="2735580" cy="765810"/>
                 <wp:effectExtent l="0" t="0" r="0" b="0"/>
@@ -1754,7 +1759,7 @@
           </mc:Choice>
           <mc:Fallback>
             <w:pict>
-              <v:shape w14:anchorId="07DCC27C" id="Text Box 7" o:spid="_x0000_s1031" type="#_x0000_t202" style="position:absolute;left:0;text-align:left;margin-left:38.4pt;margin-top:63.9pt;width:215.4pt;height:60.3pt;z-index:251666432;visibility:visible;mso-wrap-style:square;mso-height-percent:0;mso-wrap-distance-left:9pt;mso-wrap-distance-top:0;mso-wrap-distance-right:9pt;mso-wrap-distance-bottom:0;mso-position-horizontal:absolute;mso-position-horizontal-relative:page;mso-position-vertical:absolute;mso-position-vertical-relative:text;mso-height-percent:0;mso-height-relative:margin;v-text-anchor:top" o:gfxdata="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" fillcolor="white [3201]" stroked="f" strokeweight=".5pt">
+              <v:shape w14:anchorId="07DCC27C" id="Text Box 7" o:spid="_x0000_s1031" type="#_x0000_t202" style="position:absolute;left:0;text-align:left;margin-left:38.4pt;margin-top:89.5pt;width:215.4pt;height:60.3pt;z-index:251666432;visibility:visible;mso-wrap-style:square;mso-height-percent:0;mso-wrap-distance-left:9pt;mso-wrap-distance-top:0;mso-wrap-distance-right:9pt;mso-wrap-distance-bottom:0;mso-position-horizontal:absolute;mso-position-horizontal-relative:page;mso-position-vertical:absolute;mso-position-vertical-relative:text;mso-height-percent:0;mso-height-relative:margin;v-text-anchor:top" o:gfxdata="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" fillcolor="white [3201]" stroked="f" strokeweight=".5pt">
                 <v:textbox>
                   <w:txbxContent>
                     <w:p>

</xml_diff>